<commit_message>
docs: replace the presentation with the rebuilt v2 deck
The first deck read as generated: repeated title-and-bullets layouts, generic
headings and claims with no numbers behind them. This one is rebuilt on the SVU
template around real artefacts — screenshots of the running app, our own
architecture diagram, and measured figures from the test run.

- Deck, speaking script and assumptions note now sit directly in
  docs/presentation/; the superseded v1 deck and script are removed
- docs/presentation/screenshots/ holds the exact crops embedded in the slides
- Adds the v2 architecture diagram used on slide 3

Co-Authored-By: Claude Opus 5 <noreply@anthropic.com>
</commit_message>
<xml_diff>
--- a/docs/presentation/AquaWise_Presentation_Script.docx
+++ b/docs/presentation/AquaWise_Presentation_Script.docx
@@ -14,9 +14,10 @@
       <w:r>
         <w:rPr>
           <w:i/>
-          <w:sz w:val="21"/>
+          <w:color w:val="44546A"/>
+          <w:sz w:val="19"/>
         </w:rPr>
-        <w:t>About 562 words, about 4 minutes at a steady 140 words per minute. Pause briefly at each slide change. Speaker labels are up to you: one natural split is Speaker A for slides 1–2 and 5, Speaker B for slides 3–4.</w:t>
+        <w:t>530 words ≈ 4 minutes at 135 words per minute. One paragraph = one breath group; pause at each line break and at every slide change. Replace [Name 1] and [Name 2] before the viva.</w:t>
       </w:r>
     </w:p>
     <w:p>
@@ -24,40 +25,31 @@
         <w:pStyle w:val="Heading2"/>
       </w:pPr>
       <w:r>
-        <w:t>Slide 1 — Title   (0:00–0:30)</w:t>
+        <w:t>Slide 1 · Title — the product already working   (0:00–0:44)</w:t>
       </w:r>
     </w:p>
     <w:p>
       <w:pPr>
-        <w:spacing w:after="120"/>
+        <w:spacing w:after="160" w:line="300" w:lineRule="auto"/>
       </w:pPr>
       <w:r>
-        <w:t>Good morning. We are Jaineel Patel and [teammate name] from TY EXCP-A, and our guide is Prof. Sonia Joshi.</w:t>
+        <w:t>Good morning. We are [Name 1] and [Name 2] from TY EXCP-A; our guide is Prof. Sonia Joshi. Our project is AquaWise.</w:t>
       </w:r>
     </w:p>
     <w:p>
       <w:pPr>
-        <w:spacing w:after="120"/>
+        <w:spacing w:after="160" w:line="300" w:lineRule="auto"/>
       </w:pPr>
       <w:r>
-        <w:t>Our Web Programming Laboratory mini project is AquaWise, a smart water conservation and awareness portal.</w:t>
+        <w:t>Before the problem, look at the screenshot on the right. That is our running application, not a mock-up: a family of four in Mumbai, 678 litres a day, 169.55 per person, already flagged as above the city norm.</w:t>
       </w:r>
     </w:p>
     <w:p>
       <w:pPr>
-        <w:spacing w:after="120"/>
+        <w:spacing w:after="160" w:line="300" w:lineRule="auto"/>
       </w:pPr>
       <w:r>
-        <w:t>It is mapped to UN Sustainable Development Goal 6, clean water and sanitation. In one line: AquaWise helps a household measure its water use, act correctly in a water crisis, and report problems to its housing society.</w:t>
-      </w:r>
-    </w:p>
-    <w:p>
-      <w:r>
-        <w:rPr>
-          <w:color w:val="5B6B7E"/>
-          <w:sz w:val="18"/>
-        </w:rPr>
-        <w:t>71 words</w:t>
+        <w:t>The next four minutes are about three things: how we made that number trustworthy, what the family should do next, and who in their building should act on it. Three tools, one database, and a test behind every figure we show.</w:t>
       </w:r>
     </w:p>
     <w:p>
@@ -65,48 +57,31 @@
         <w:pStyle w:val="Heading2"/>
       </w:pPr>
       <w:r>
-        <w:t>Slide 2 — Problem statement   (0:30–1:18)</w:t>
+        <w:t>Slide 2 · Problem — measure, diagnose, route   (0:44–1:32)</w:t>
       </w:r>
     </w:p>
     <w:p>
       <w:pPr>
-        <w:spacing w:after="120"/>
+        <w:spacing w:after="160" w:line="300" w:lineRule="auto"/>
       </w:pPr>
       <w:r>
-        <w:t>The problem is big and close to home. According to WHO and UNICEF, 2.1 billion people, one in four, still lacked safely managed drinking water in 2024.</w:t>
+        <w:t>Most water-awareness material tells everyone the same thing: save water. But a household cannot act on advice that is not about them.</w:t>
       </w:r>
     </w:p>
     <w:p>
       <w:pPr>
-        <w:spacing w:after="120"/>
+        <w:spacing w:after="160" w:line="300" w:lineRule="auto"/>
       </w:pPr>
       <w:r>
-        <w:t>In India, NITI Aayog reports that about 600 million people face high to extreme water stress, and that demand is expected to be twice the available supply by 2030.</w:t>
+        <w:t>Look at the two ends of our scale. A family on tanker supply getting 50 litres per person is already below the Jal Jeevan Mission line. Telling them to take shorter showers is not just useless, it is wrong: their problem is supply. Our test household at 169.55 is the opposite case.</w:t>
       </w:r>
     </w:p>
     <w:p>
       <w:pPr>
-        <w:spacing w:after="120"/>
+        <w:spacing w:after="160" w:line="300" w:lineRule="auto"/>
       </w:pPr>
       <w:r>
-        <w:t>But at the household level, people cannot see how their daily use compares with the norm. When a pipe bursts or the supply stops, nobody knows the right first steps. And complaints to the society get lost in phone calls and chat groups.</w:t>
-      </w:r>
-    </w:p>
-    <w:p>
-      <w:pPr>
-        <w:spacing w:after="120"/>
-      </w:pPr>
-      <w:r>
-        <w:t>AquaWise answers each of these gaps: measure, advise, and act, in one portal.</w:t>
-      </w:r>
-    </w:p>
-    <w:p>
-      <w:r>
-        <w:rPr>
-          <w:color w:val="5B6B7E"/>
-          <w:sz w:val="18"/>
-        </w:rPr>
-        <w:t>112 words</w:t>
+        <w:t>So the calculator flags under-supply as well as over-use. And when something goes wrong at night, the next question is always: who do I call, and who in this building owns it?</w:t>
       </w:r>
     </w:p>
     <w:p>
@@ -114,56 +89,31 @@
         <w:pStyle w:val="Heading2"/>
       </w:pPr>
       <w:r>
-        <w:t>Slide 3 — System architecture   (1:18–2:18)</w:t>
+        <w:t>Slide 3 · Architecture — the shared module   (1:32–2:19)</w:t>
       </w:r>
     </w:p>
     <w:p>
       <w:pPr>
-        <w:spacing w:after="120"/>
+        <w:spacing w:after="160" w:line="300" w:lineRule="auto"/>
       </w:pPr>
       <w:r>
-        <w:t>AquaWise is a three-tier MERN application. Let me follow the numbered arrows.</w:t>
+        <w:t>The decision we would defend first is the shared folder.</w:t>
       </w:r>
     </w:p>
     <w:p>
       <w:pPr>
-        <w:spacing w:after="120"/>
+        <w:spacing w:after="160" w:line="300" w:lineRule="auto"/>
       </w:pPr>
       <w:r>
-        <w:t>One: the browser loads our React and Bootstrap front end from Vercel. The calculator and advisory modules run right in the browser, so even a guest gets instant results.</w:t>
+        <w:t>The calculator runs in the browser, so a guest gets an answer without an account. But when a logged-in user saves a result, the server cannot trust what the browser sent; anyone can edit a request. Writing the formulas twice, once in React and once in Express, works until someone changes a constant in only one copy.</w:t>
       </w:r>
     </w:p>
     <w:p>
       <w:pPr>
-        <w:spacing w:after="120"/>
+        <w:spacing w:after="160" w:line="300" w:lineRule="auto"/>
       </w:pPr>
       <w:r>
-        <w:t>Two: for anything that needs an account, the API client calls our Node.js and Express REST API on Render over HTTPS, sending JSON and a session cookie. Every request passes through security middleware: helmet, CORS, rate limiting on login, and express-session. Six route groups then handle authentication, the calculator, advisory, societies, complaints and the dashboard.</w:t>
-      </w:r>
-    </w:p>
-    <w:p>
-      <w:pPr>
-        <w:spacing w:after="120"/>
-      </w:pPr>
-      <w:r>
-        <w:t>Three: sessions are stored in MongoDB with a two-hour expiry.</w:t>
-      </w:r>
-    </w:p>
-    <w:p>
-      <w:pPr>
-        <w:spacing w:after="120"/>
-      </w:pPr>
-      <w:r>
-        <w:t>And four: Mongoose models read and write our four collections in MongoDB Atlas over an encrypted connection. The same formulas and rules file are shared by client and server, so results always match.</w:t>
-      </w:r>
-    </w:p>
-    <w:p>
-      <w:r>
-        <w:rPr>
-          <w:color w:val="5B6B7E"/>
-          <w:sz w:val="18"/>
-        </w:rPr>
-        <w:t>139 words</w:t>
+        <w:t>So the formulas and the advisory rules live in one folder that both sides import. Our API test sends a forged total; the server discards it, recomputes and stores its own figure. The numbered arrows show a request's path.</w:t>
       </w:r>
     </w:p>
     <w:p>
@@ -171,48 +121,39 @@
         <w:pStyle w:val="Heading2"/>
       </w:pPr>
       <w:r>
-        <w:t>Slide 4 — Features   (2:18–3:22)</w:t>
+        <w:t>Slide 4 · Features — every tool ends in an action   (2:19–3:07)</w:t>
       </w:r>
     </w:p>
     <w:p>
       <w:pPr>
-        <w:spacing w:after="120"/>
+        <w:spacing w:after="160" w:line="300" w:lineRule="auto"/>
       </w:pPr>
       <w:r>
-        <w:t>We built three core functionalities.</w:t>
+        <w:t>Each tool ends with something a person can do today.</w:t>
       </w:r>
     </w:p>
     <w:p>
       <w:pPr>
-        <w:spacing w:after="120"/>
+        <w:spacing w:after="160" w:line="300" w:lineRule="auto"/>
       </w:pPr>
       <w:r>
-        <w:t>First, the water usage calculator. A family enters its members, bathing habits, washing-machine loads, garden and taps. It returns litres per day for eight activities and litres per person, and compares that with WHO, Jal Jeevan Mission and CPHEEO norms. Here, a family of four in Mumbai uses 169.6 litres per person, which is over the 150-litre city norm.</w:t>
+        <w:t>The calculator ranks where the litres go and prices the fix: for our test household, a WaterSense shower head alone saves about 59 litres a day.</w:t>
       </w:r>
     </w:p>
     <w:p>
       <w:pPr>
-        <w:spacing w:after="120"/>
+        <w:spacing w:after="160" w:line="300" w:lineRule="auto"/>
       </w:pPr>
       <w:r>
-        <w:t>Second, the crisis advisory engine. The user picks one of five problems, such as a leak or contamination, and answers up to three questions. Fourteen rules then give ordered steps and the right contacts. Critical cases, like a burst pipe near electrics, show a one-tap 112 call.</w:t>
+        <w:t>The advisory engine asks at most three questions. Burst pipe, water near the switches: rule LK-3, critical. The 112 banner comes first, then six steps in fixed order, then the society admin's real number, because this user is a member.</w:t>
       </w:r>
     </w:p>
     <w:p>
       <w:pPr>
-        <w:spacing w:after="120"/>
+        <w:spacing w:after="160" w:line="300" w:lineRule="auto"/>
       </w:pPr>
       <w:r>
-        <w:t>Third, the society portal. Residents log in, join their society with a code and file complaints, which are routed automatically to the right handler. The dashboard shows active, in-progress and resolved issues, with a full history of every update.</w:t>
-      </w:r>
-    </w:p>
-    <w:p>
-      <w:r>
-        <w:rPr>
-          <w:color w:val="5B6B7E"/>
-          <w:sz w:val="18"/>
-        </w:rPr>
-        <w:t>150 words</w:t>
+        <w:t>And the portal routes by category. Complaint 0004 was about drinking water, so it went to Priya Nair, who handles tanks and water quality, not to the secretary. Every status change is kept.</w:t>
       </w:r>
     </w:p>
     <w:p>
@@ -220,45 +161,234 @@
         <w:pStyle w:val="Heading2"/>
       </w:pPr>
       <w:r>
-        <w:t>Slide 5 — Result, conclusion and references   (3:22–4:00)</w:t>
+        <w:t>Slide 5 · Result, conclusion, references   (3:07–3:55)</w:t>
       </w:r>
     </w:p>
     <w:p>
       <w:pPr>
-        <w:spacing w:after="120"/>
+        <w:spacing w:after="160" w:line="300" w:lineRule="auto"/>
       </w:pPr>
       <w:r>
-        <w:t>Our results so far: the calculator matches our hand-worked test case exactly, and efficient fixtures bring that family down by 14.7 percent, back inside the norm. The advisory engine covers five crisis types with fourteen rules, and all seven screens are responsive and meet accessibility contrast standards.</w:t>
+        <w:t>The result we trust most is the test suite, because we can rerun it in front of you: fifty-two automated tests, twenty-three on the pure logic and twenty-nine that drive the real API, including every permission check.</w:t>
       </w:r>
     </w:p>
     <w:p>
       <w:pPr>
-        <w:spacing w:after="120"/>
+        <w:spacing w:after="160" w:line="300" w:lineRule="auto"/>
       </w:pPr>
       <w:r>
-        <w:t>To conclude, AquaWise brings awareness, crisis help and society action into one portal, and every number it shows comes from a cited source. Next, we plan real usage data, SMS alerts and regional languages.</w:t>
+        <w:t>The more useful part is the defect list. Six defects, all found by tests or a scripted run-through. The first mattered most: a misspelt constant turned every total into "not a number". The test caught it only because the expected 678.18 came from our requirements, worked by hand.</w:t>
       </w:r>
     </w:p>
     <w:p>
       <w:pPr>
-        <w:spacing w:after="120"/>
+        <w:spacing w:after="160" w:line="300" w:lineRule="auto"/>
       </w:pPr>
       <w:r>
-        <w:t>Thank you. We are happy to take your questions.</w:t>
+        <w:t>Next, we want verified helplines beyond Mumbai and Indian fixture data instead of US figures. Thank you; we are happy to take questions.</w:t>
+      </w:r>
+    </w:p>
+    <w:p>
+      <w:pPr>
+        <w:pStyle w:val="Heading2"/>
+      </w:pPr>
+      <w:r>
+        <w:t>If you are interrupted</w:t>
       </w:r>
     </w:p>
     <w:p>
       <w:r>
         <w:rPr>
-          <w:color w:val="5B6B7E"/>
-          <w:sz w:val="18"/>
+          <w:i/>
+          <w:color w:val="44546A"/>
+          <w:sz w:val="19"/>
         </w:rPr>
-        <w:t>90 words</w:t>
+        <w:t>The two most likely questions per slide, with a one-line answer. The same list is in each slide’s speaker notes.</w:t>
+      </w:r>
+    </w:p>
+    <w:p>
+      <w:r>
+        <w:rPr>
+          <w:b/>
+        </w:rPr>
+        <w:t>Slide 1</w:t>
+      </w:r>
+    </w:p>
+    <w:p>
+      <w:pPr>
+        <w:pStyle w:val="ListBullet"/>
+      </w:pPr>
+      <w:r>
+        <w:rPr>
+          <w:b/>
+        </w:rPr>
+        <w:t xml:space="preserve">Why put three tools in one project instead of doing one well? </w:t>
+      </w:r>
+      <w:r>
+        <w:t>→ Each covers a different failure: not knowing your usage, not knowing the first step, not knowing who fixes it — they share one user, one society and one database.</w:t>
+      </w:r>
+    </w:p>
+    <w:p>
+      <w:pPr>
+        <w:pStyle w:val="ListBullet"/>
+      </w:pPr>
+      <w:r>
+        <w:rPr>
+          <w:b/>
+        </w:rPr>
+        <w:t xml:space="preserve">Which SDG 6 targets, exactly? </w:t>
+      </w:r>
+      <w:r>
+        <w:t>→ 6.4 (water-use efficiency) through the calculator; 6.1 (safe drinking water) through the advisory and complaint routing.</w:t>
+      </w:r>
+    </w:p>
+    <w:p>
+      <w:r>
+        <w:rPr>
+          <w:b/>
+        </w:rPr>
+        <w:t>Slide 2</w:t>
+      </w:r>
+    </w:p>
+    <w:p>
+      <w:pPr>
+        <w:pStyle w:val="ListBullet"/>
+      </w:pPr>
+      <w:r>
+        <w:rPr>
+          <w:b/>
+        </w:rPr>
+        <w:t xml:space="preserve">NITI Aayog’s index is from 2018 — is it still valid? </w:t>
+      </w:r>
+      <w:r>
+        <w:t>→ It is the national baseline most studies still cite; we quote it with its year on the slide and would swap in a newer edition if you prefer.</w:t>
+      </w:r>
+    </w:p>
+    <w:p>
+      <w:pPr>
+        <w:pStyle w:val="ListBullet"/>
+      </w:pPr>
+      <w:r>
+        <w:rPr>
+          <w:b/>
+        </w:rPr>
+        <w:t xml:space="preserve">Why compare against 150 and not 135 lpcd? </w:t>
+      </w:r>
+      <w:r>
+        <w:t>→ Mumbai is a metropolitan city with sewerage, where CPHEEO plans for 150; the user picks the city type and the norm switches to 135 or 70.</w:t>
+      </w:r>
+    </w:p>
+    <w:p>
+      <w:r>
+        <w:rPr>
+          <w:b/>
+        </w:rPr>
+        <w:t>Slide 3</w:t>
+      </w:r>
+    </w:p>
+    <w:p>
+      <w:pPr>
+        <w:pStyle w:val="ListBullet"/>
+      </w:pPr>
+      <w:r>
+        <w:rPr>
+          <w:b/>
+        </w:rPr>
+        <w:t xml:space="preserve">Why server-side sessions instead of JWT? </w:t>
+      </w:r>
+      <w:r>
+        <w:t>→ Our syllabus specifies session-based auth, and a server session can be destroyed — TC-API-06 shows /me returns 401 straight after logout.</w:t>
+      </w:r>
+    </w:p>
+    <w:p>
+      <w:pPr>
+        <w:pStyle w:val="ListBullet"/>
+      </w:pPr>
+      <w:r>
+        <w:rPr>
+          <w:b/>
+        </w:rPr>
+        <w:t xml:space="preserve">If the maths runs in the browser, can’t a user fake a saved result? </w:t>
+      </w:r>
+      <w:r>
+        <w:t>→ No: the server recomputes from the inputs and ignores any results field — TC-API-24 sends a forged total and asserts it was discarded.</w:t>
+      </w:r>
+    </w:p>
+    <w:p>
+      <w:r>
+        <w:rPr>
+          <w:b/>
+        </w:rPr>
+        <w:t>Slide 4</w:t>
+      </w:r>
+    </w:p>
+    <w:p>
+      <w:pPr>
+        <w:pStyle w:val="ListBullet"/>
+      </w:pPr>
+      <w:r>
+        <w:rPr>
+          <w:b/>
+        </w:rPr>
+        <w:t xml:space="preserve">Why rules and not machine learning for the advisory? </w:t>
+      </w:r>
+      <w:r>
+        <w:t>→ Safety advice has to be predictable and auditable; each of the 14 rules is a JSON record with a unit test, and we have no labelled data to train on.</w:t>
+      </w:r>
+    </w:p>
+    <w:p>
+      <w:pPr>
+        <w:pStyle w:val="ListBullet"/>
+      </w:pPr>
+      <w:r>
+        <w:rPr>
+          <w:b/>
+        </w:rPr>
+        <w:t xml:space="preserve">What happens if no contact handles a complaint’s category? </w:t>
+      </w:r>
+      <w:r>
+        <w:t>→ It falls back to the society admin, so nothing is ever unassigned — TC-API-14.</w:t>
+      </w:r>
+    </w:p>
+    <w:p>
+      <w:r>
+        <w:rPr>
+          <w:b/>
+        </w:rPr>
+        <w:t>Slide 5</w:t>
+      </w:r>
+    </w:p>
+    <w:p>
+      <w:pPr>
+        <w:pStyle w:val="ListBullet"/>
+      </w:pPr>
+      <w:r>
+        <w:rPr>
+          <w:b/>
+        </w:rPr>
+        <w:t xml:space="preserve">Didn’t you write the tests to match your own code? </w:t>
+      </w:r>
+      <w:r>
+        <w:t>→ The expected values come from the requirements document, calculated by hand — which is exactly how defect D1 was caught.</w:t>
+      </w:r>
+    </w:p>
+    <w:p>
+      <w:pPr>
+        <w:pStyle w:val="ListBullet"/>
+      </w:pPr>
+      <w:r>
+        <w:rPr>
+          <w:b/>
+        </w:rPr>
+        <w:t xml:space="preserve">What about the manual test cases? </w:t>
+      </w:r>
+      <w:r>
+        <w:t>→ Eighteen are listed in docs/testing.md; six are recorded as passing so far (including 360 px layout and all three end-to-end flows), and we complete the rest in the demo run-through.</w:t>
       </w:r>
     </w:p>
     <w:sectPr>
       <w:pgSz w:w="12240" w:h="15840"/>
-      <w:pgMar w:top="1440" w:right="1247" w:bottom="1440" w:left="1247" w:header="720" w:footer="720" w:gutter="0"/>
+      <w:pgMar w:top="1134" w:right="1247" w:bottom="1134" w:left="1247" w:header="720" w:footer="720" w:gutter="0"/>
       <w:cols w:space="720"/>
       <w:docGrid w:linePitch="360"/>
     </w:sectPr>
@@ -630,8 +760,8 @@
     <w:qFormat/>
     <w:rsid w:val="00FC693F"/>
     <w:rPr>
-      <w:rFonts w:ascii="Calibri" w:hAnsi="Calibri"/>
-      <w:sz w:val="24"/>
+      <w:rFonts w:ascii="Arial" w:hAnsi="Arial"/>
+      <w:sz w:val="23"/>
     </w:rPr>
   </w:style>
   <w:style w:type="paragraph" w:styleId="Header">
@@ -693,10 +823,10 @@
       <w:outlineLvl w:val="0"/>
     </w:pPr>
     <w:rPr>
-      <w:rFonts w:asciiTheme="majorHAnsi" w:eastAsiaTheme="majorEastAsia" w:hAnsiTheme="majorHAnsi" w:cstheme="majorBidi"/>
+      <w:rFonts w:asciiTheme="majorHAnsi" w:eastAsiaTheme="majorEastAsia" w:hAnsiTheme="majorHAnsi" w:cstheme="majorBidi" w:ascii="Arial" w:hAnsi="Arial"/>
       <w:b/>
       <w:bCs/>
-      <w:color w:val="365F91" w:themeColor="accent1" w:themeShade="BF"/>
+      <w:color w:val="A42530"/>
       <w:sz w:val="28"/>
       <w:szCs w:val="28"/>
     </w:rPr>
@@ -717,10 +847,10 @@
       <w:outlineLvl w:val="1"/>
     </w:pPr>
     <w:rPr>
-      <w:rFonts w:asciiTheme="majorHAnsi" w:eastAsiaTheme="majorEastAsia" w:hAnsiTheme="majorHAnsi" w:cstheme="majorBidi"/>
+      <w:rFonts w:asciiTheme="majorHAnsi" w:eastAsiaTheme="majorEastAsia" w:hAnsiTheme="majorHAnsi" w:cstheme="majorBidi" w:ascii="Arial" w:hAnsi="Arial"/>
       <w:b/>
       <w:bCs/>
-      <w:color w:val="4F81BD" w:themeColor="accent1"/>
+      <w:color w:val="A42530"/>
       <w:sz w:val="26"/>
       <w:szCs w:val="26"/>
     </w:rPr>

</xml_diff>